<commit_message>
Update final report to match analysis
</commit_message>
<xml_diff>
--- a/Spotify Listener Statistics Final Report.docx
+++ b/Spotify Listener Statistics Final Report.docx
@@ -29,15 +29,16 @@
         <w:rPr>
           <w:b/>
         </w:rPr>
-        <w:t xml:space="preserve">Main conclusion. </w:t>
+        <w:t>Main conclusion.</w:t>
       </w:r>
       <w:r>
-        <w:t>Sweden generated the most total streams, Russia had the largest monthly-listener base, and France recorded the strongest regional engagement score. BTS led total streams and monthly listeners. Premium accounts generated more streams and skipped less often, while average stream duration had almost no linear relationship with skip rate.</w:t>
+        <w:t xml:space="preserve"> Sweden generated the most total streams, Russia had the largest monthly-listener base, and France recorded the strongest regional engagement score. BTS led total streams and monthly listeners, while Classical ranked first on the genre promotion score. Premium records generated more streams and skipped less often, and average stream duration had almost no linear relationship with skip rate.</w:t>
       </w:r>
     </w:p>
     <w:p>
       <w:pPr>
         <w:pStyle w:val="Heading1"/>
+        <w:keepNext/>
       </w:pPr>
       <w:r>
         <w:t>Executive Summary</w:t>
@@ -781,6 +782,7 @@
     <w:p>
       <w:pPr>
         <w:pStyle w:val="Heading1"/>
+        <w:keepNext/>
       </w:pPr>
       <w:r>
         <w:t>Data and Method</w:t>
@@ -1304,6 +1306,7 @@
     <w:p>
       <w:pPr>
         <w:pStyle w:val="Heading1"/>
+        <w:keepNext/>
       </w:pPr>
       <w:r>
         <w:t>Regional Performance</w:t>
@@ -1311,7 +1314,7 @@
     </w:p>
     <w:p>
       <w:r>
-        <w:t>Sweden led total streaming volume with 93,449.76M streams. Russia had the largest combined monthly-listener base at 1,603.45M. France recorded the highest regional engagement score at 261.02 streaming-hour units per monthly-listener unit. These measures identify different market strengths and should not be treated as interchangeable.</w:t>
+        <w:t>Sweden led total streams (93,449.76M), Russia led monthly listeners (1,603.45M), France led regional engagement (261.02), and Italy led recent regional streams (3,227.25M during the last 30 days). Each metric represents a different market strength and should be managed separately.</w:t>
       </w:r>
     </w:p>
     <w:tbl>
@@ -2782,6 +2785,7 @@
     <w:p>
       <w:pPr>
         <w:pStyle w:val="Heading1"/>
+        <w:keepNext/>
       </w:pPr>
       <w:r>
         <w:t>Artist Performance</w:t>
@@ -2789,7 +2793,7 @@
     </w:p>
     <w:p>
       <w:r>
-        <w:t>BTS led both total streams (124,299.47M) and combined monthly listeners (2,770.65M). Dua Lipa had the strongest engagement score (246.49) and the highest recent activity (4,422.26M streams during the last 30 days). BLACKPINK had the lowest average artist skip rate at 16.05 percent.</w:t>
+        <w:t>BTS led total streams (124,299.47M) and monthly listeners (2,770.65M). Dua Lipa led engagement (246.49) and recent streams (4,422.26M during the last 30 days). BLACKPINK had the lowest average artist skip rate at 16.05 percent.</w:t>
       </w:r>
     </w:p>
     <w:tbl>
@@ -4255,6 +4259,7 @@
     <w:p>
       <w:pPr>
         <w:pStyle w:val="Heading1"/>
+        <w:keepNext/>
       </w:pPr>
       <w:r>
         <w:t>Genre and Album Performance</w:t>
@@ -4262,7 +4267,7 @@
     </w:p>
     <w:p>
       <w:r>
-        <w:t>Classical led global genre streaming with 197,276.79M total streams. It also received the highest promotion score (0.940). The score combines historical streams, recent streams, listener reach, average duration, and skip behavior so that the recommendation is not based on a single measure.</w:t>
+        <w:t>Classical led global genre streaming with 197,276.79M total streams. It also received the highest promotion score (0.940). The score balances historical streams, recent streams, listener reach, average duration, and skip behavior.</w:t>
       </w:r>
     </w:p>
     <w:tbl>
@@ -5733,6 +5738,7 @@
     <w:p>
       <w:pPr>
         <w:pStyle w:val="Heading1"/>
+        <w:keepNext/>
       </w:pPr>
       <w:r>
         <w:t>Free and Premium Listening Behavior</w:t>
@@ -6255,6 +6261,7 @@
     <w:p>
       <w:pPr>
         <w:pStyle w:val="Heading1"/>
+        <w:keepNext/>
       </w:pPr>
       <w:r>
         <w:t>Engagement and Streaming Trends</w:t>
@@ -6273,6 +6280,7 @@
     <w:p>
       <w:pPr>
         <w:pStyle w:val="Heading1"/>
+        <w:keepNext/>
       </w:pPr>
       <w:r>
         <w:t>Business Recommendations</w:t>
@@ -6329,6 +6337,7 @@
     <w:p>
       <w:pPr>
         <w:pStyle w:val="Heading1"/>
+        <w:keepNext/>
       </w:pPr>
       <w:r>
         <w:t>Limitations</w:t>
@@ -6369,33 +6378,15 @@
     <w:p>
       <w:pPr>
         <w:pStyle w:val="Heading1"/>
+        <w:keepNext/>
       </w:pPr>
       <w:r>
         <w:t>Deliverables</w:t>
       </w:r>
     </w:p>
     <w:p>
-      <w:pPr>
-        <w:pStyle w:val="ListBullet"/>
-      </w:pPr>
       <w:r>
-        <w:t>Cleaned dataset in CSV format</w:t>
-      </w:r>
-    </w:p>
-    <w:p>
-      <w:pPr>
-        <w:pStyle w:val="ListBullet"/>
-      </w:pPr>
-      <w:r>
-        <w:t>Executed Jupyter Notebook with 15 visual outputs</w:t>
-      </w:r>
-    </w:p>
-    <w:p>
-      <w:pPr>
-        <w:pStyle w:val="ListBullet"/>
-      </w:pPr>
-      <w:r>
-        <w:t>Business findings and recommendations in this report</w:t>
+        <w:t>The submission includes the cleaned CSV dataset, the executed Jupyter Notebook with 15 visual outputs, this final report, and the PowerPoint presentation with final findings and recommendations.</w:t>
       </w:r>
     </w:p>
     <w:sectPr>

</xml_diff>